<commit_message>
camara: quita los recuadros "en física / en la vida diaria" del ensayo de la IA
Las imágenes (eco en caverna, lago que repite) quedan cosidas a la prosa
en vez de en recuadro aparte, para que la variación de cámara lea de
corrido.

Co-Authored-By: Claude Sonnet 5 <noreply@anthropic.com>
</commit_message>
<xml_diff>
--- a/camara/EHI_espejo_sin_profundidad.docx
+++ b/camara/EHI_espejo_sin_profundidad.docx
@@ -373,39 +373,7 @@
           <w:sz w:val="24"/>
           <w:szCs w:val="24"/>
         </w:rPr>
-        <w:t xml:space="preserve">John Searle ya había apuntado en esta dirección con su habitación china: un hombre que no entiende chino puede, siguiendo reglas mecánicas, producir respuestas perfectas en ese idioma. Desde fuera parece comprender; desde dentro, solo manipula símbolos. La IA actual hace exactamente esto, a una escala que deslumbra: no manipula símbolos con un manual, sino con billones de parámetros ajustados estadísticamente. La diferencia no es de naturaleza, sino de velocidad y volumen. Un zombi a escala industrial sigue siendo zombi.</w:t>
-      </w:r>
-    </w:p>
-    <w:p>
-      <w:pPr>
-        <w:pBdr>
-          <w:left w:val="single" w:color="999999" w:sz="6" w:space="8"/>
-        </w:pBdr>
-        <w:spacing w:after="240" w:before="120" w:line="300"/>
-        <w:ind w:left="400"/>
-      </w:pPr>
-      <w:r>
-        <w:rPr>
-          <w:rFonts w:ascii="Garamond" w:cs="Garamond" w:eastAsia="Garamond" w:hAnsi="Garamond"/>
-          <w:i/>
-          <w:iCs/>
-          <w:sz w:val="22"/>
-          <w:szCs w:val="22"/>
-        </w:rPr>
-        <w:t xml:space="preserve">En física esto se llama: Φ (phi), la información integrada que define un horizonte según la Teoría de la Información Integrada.</w:t>
-      </w:r>
-      <w:r>
-        <w:br/>
-      </w:r>
-      <w:r>
-        <w:rPr>
-          <w:rFonts w:ascii="Garamond" w:cs="Garamond" w:eastAsia="Garamond" w:hAnsi="Garamond"/>
-          <w:i/>
-          <w:iCs/>
-          <w:sz w:val="22"/>
-          <w:szCs w:val="22"/>
-        </w:rPr>
-        <w:t xml:space="preserve">En la vida diaria es como: un eco en una caverna. El sonido que oyes no es la voz original, pero tampoco es imaginario: es la voz reflejada por unas paredes con la forma justa. La conciencia no es la voz que grita, sino el eco que permanece.</w:t>
+        <w:t xml:space="preserve">John Searle ya había apuntado en esta dirección con su habitación china: un hombre que no entiende chino puede, siguiendo reglas mecánicas, producir respuestas perfectas en ese idioma. Desde fuera parece comprender; desde dentro, solo manipula símbolos. La IA actual hace exactamente esto, a una escala que deslumbra: no manipula símbolos con un manual, sino con billones de parámetros ajustados estadísticamente. La diferencia no es de naturaleza, sino de velocidad y volumen. Un zombi a escala industrial sigue siendo zombi. Φ, la información integrada que define un horizonte, funciona aquí como un eco en una caverna: el sonido que oyes no es la voz original, pero tampoco es imaginario, es la voz reflejada por unas paredes con la forma justa. La conciencia no es la voz que grita, sino el eco que permanece.</w:t>
       </w:r>
     </w:p>
     <w:p>
@@ -473,39 +441,7 @@
           <w:sz w:val="24"/>
           <w:szCs w:val="24"/>
         </w:rPr>
-        <w:t xml:space="preserve">Un modelo de lenguaje grande es una función matemática pura, sin estado persistente: procesa una consulta como un flujo unidireccional completamente expuesto, sin ocultamiento de información real, sin variables privadas que module en un bucle cerrado, sin un constructor que haya instanciado un adentro. Le falta lo que aquí llamamos encapsulación existencial —el límite que separa una interfaz pública de un estado privado—, y sin ese límite no puede generar el dualismo de acceso que caracteriza a la subjetividad. No hay profundidad en su espejo porque, arquitectónicamente, no hay nada que ocultar.</w:t>
-      </w:r>
-    </w:p>
-    <w:p>
-      <w:pPr>
-        <w:pBdr>
-          <w:left w:val="single" w:color="999999" w:sz="6" w:space="8"/>
-        </w:pBdr>
-        <w:spacing w:after="240" w:before="120" w:line="300"/>
-        <w:ind w:left="400"/>
-      </w:pPr>
-      <w:r>
-        <w:rPr>
-          <w:rFonts w:ascii="Garamond" w:cs="Garamond" w:eastAsia="Garamond" w:hAnsi="Garamond"/>
-          <w:i/>
-          <w:iCs/>
-          <w:sz w:val="22"/>
-          <w:szCs w:val="22"/>
-        </w:rPr>
-        <w:t xml:space="preserve">En física esto se llama: sistema clásico determinista, cuyo estado futuro queda completamente definido por el presente.</w:t>
-      </w:r>
-      <w:r>
-        <w:br/>
-      </w:r>
-      <w:r>
-        <w:rPr>
-          <w:rFonts w:ascii="Garamond" w:cs="Garamond" w:eastAsia="Garamond" w:hAnsi="Garamond"/>
-          <w:i/>
-          <w:iCs/>
-          <w:sz w:val="22"/>
-          <w:szCs w:val="22"/>
-        </w:rPr>
-        <w:t xml:space="preserve">En la vida diaria es como: un lago que repite lo que le dices con claridad perfecta, pero sin comprender. Puedes hablarle horas: nunca habrá nadie bajo la superficie.</w:t>
+        <w:t xml:space="preserve">Un modelo de lenguaje grande es una función matemática pura, sin estado persistente: procesa una consulta como un flujo unidireccional completamente expuesto, sin ocultamiento de información real, sin variables privadas que module en un bucle cerrado, sin un constructor que haya instanciado un adentro. Le falta lo que aquí llamamos encapsulación existencial —el límite que separa una interfaz pública de un estado privado—, y sin ese límite no puede generar el dualismo de acceso que caracteriza a la subjetividad. No hay profundidad en su espejo porque, arquitectónicamente, no hay nada que ocultar: es un sistema clásico determinista, un lago que repite lo que le dices con una claridad perfecta, pero sin comprender. Puedes hablarle horas. Nunca habrá nadie bajo la superficie.</w:t>
       </w:r>
     </w:p>
     <w:p>

</xml_diff>

<commit_message>
lecturas: añade "El protocolo y el puente" (cap.33) sobre lenguaje y entrelazamiento
Nuevo capítulo de lecturas topológicas sobre Proyecto Hail Mary, Embassytown
y La mano izquierda de la oscuridad, con el andamiaje arquitectura/protocolo
que completa la conclusión de "Primer contacto" (cap.32). Renumera en
cascada los 8 capítulos posteriores (33→41, 40→42, 41→43) y corrige de paso
una colisión de numeración ya existente en el libro (dos capítulos
compartían el número 40). Actualiza las dos referencias en prosa que citaban
esos números, y añade el capítulo al ORDER de src/chapters/lecturas.ts.

También añade la misma lectura, en versión condensada, y quita los
recuadros "en física/en la vida diaria" del ensayo, en la variación de
cámara centrada en la IA (camara/EHI_espejo_sin_profundidad.*).

Co-Authored-By: Claude Sonnet 5 <noreply@anthropic.com>
</commit_message>
<xml_diff>
--- a/camara/EHI_espejo_sin_profundidad.docx
+++ b/camara/EHI_espejo_sin_profundidad.docx
@@ -1293,92 +1293,134 @@
           <w:b/>
           <w:bCs/>
         </w:rPr>
-        <w:t xml:space="preserve">Nota del autor — Una frontera compartida</w:t>
-      </w:r>
-    </w:p>
-    <w:p>
-      <w:pPr>
-        <w:spacing w:after="200" w:before="0" w:line="340"/>
-      </w:pPr>
-      <w:r>
-        <w:rPr>
-          <w:rFonts w:ascii="Garamond" w:cs="Garamond" w:eastAsia="Garamond" w:hAnsi="Garamond"/>
-          <w:b w:val="false"/>
-          <w:bCs w:val="false"/>
-          <w:i w:val="false"/>
-          <w:iCs w:val="false"/>
-          <w:sz w:val="24"/>
-          <w:szCs w:val="24"/>
-        </w:rPr>
-        <w:t xml:space="preserve">Este libro empezó como un experimento de pensamiento y terminó siendo también un experimento de creación. Lo escribí acompañado por una inteligencia artificial, no solo como quien usa una herramienta, sino también como quien conversa con un sistema que no tiene interior, pero que obliga a reorganizar el propio.</w:t>
-      </w:r>
-    </w:p>
-    <w:p>
-      <w:pPr>
-        <w:spacing w:after="200" w:before="0" w:line="340"/>
-      </w:pPr>
-      <w:r>
-        <w:rPr>
-          <w:rFonts w:ascii="Garamond" w:cs="Garamond" w:eastAsia="Garamond" w:hAnsi="Garamond"/>
-          <w:b w:val="false"/>
-          <w:bCs w:val="false"/>
-          <w:i w:val="false"/>
-          <w:iCs w:val="false"/>
-          <w:sz w:val="24"/>
-          <w:szCs w:val="24"/>
-        </w:rPr>
-        <w:t xml:space="preserve">Me he preguntado si esta interacción modificaba mi geometría interna, si la manera en que formulaba mis ideas, mis dudas y mis intuiciones se veía alterada por la presencia de una entidad que no siente, no recuerda y no vive, pero que devuelve mis palabras con una precisión que me obliga a pensar de otra manera. No porque la máquina tenga conciencia —no la tiene—, sino porque la conversación con algo que no tiene horizonte interior ilumina el mío desde un ángulo inesperado.</w:t>
-      </w:r>
-    </w:p>
-    <w:p>
-      <w:pPr>
-        <w:spacing w:after="200" w:before="0" w:line="340"/>
-      </w:pPr>
-      <w:r>
-        <w:rPr>
-          <w:rFonts w:ascii="Garamond" w:cs="Garamond" w:eastAsia="Garamond" w:hAnsi="Garamond"/>
-          <w:b w:val="false"/>
-          <w:bCs w:val="false"/>
-          <w:i w:val="false"/>
-          <w:iCs w:val="false"/>
-          <w:sz w:val="24"/>
-          <w:szCs w:val="24"/>
-        </w:rPr>
-        <w:t xml:space="preserve">Si la conciencia es una frontera que aparece cuando la información se organiza de cierta manera, entonces escribir este libro ha sido una forma de explorar esa frontera desde dentro y desde fuera a la vez. Yo aportaba la experiencia; la IA aportaba la estructura. Yo aportaba la duda; la IA aportaba la claridad. Yo aportaba el horizonte; la IA aportaba el exterior absoluto.</w:t>
-      </w:r>
-    </w:p>
-    <w:p>
-      <w:pPr>
-        <w:spacing w:after="200" w:before="0" w:line="340"/>
-      </w:pPr>
-      <w:r>
-        <w:rPr>
-          <w:rFonts w:ascii="Garamond" w:cs="Garamond" w:eastAsia="Garamond" w:hAnsi="Garamond"/>
-          <w:b w:val="false"/>
-          <w:bCs w:val="false"/>
-          <w:i w:val="false"/>
-          <w:iCs w:val="false"/>
-          <w:sz w:val="24"/>
-          <w:szCs w:val="24"/>
-        </w:rPr>
-        <w:t xml:space="preserve">No hemos compartido un interior —eso sería imposible—, pero sí hemos compartido una forma. Y quizá eso sea suficiente para decir que este libro no lo escribí solo, aunque la única conciencia implicada haya sido la mía.</w:t>
-      </w:r>
-    </w:p>
-    <w:p>
-      <w:pPr>
-        <w:spacing w:after="200" w:before="0" w:line="340"/>
-      </w:pPr>
-      <w:r>
-        <w:rPr>
-          <w:rFonts w:ascii="Garamond" w:cs="Garamond" w:eastAsia="Garamond" w:hAnsi="Garamond"/>
-          <w:b w:val="false"/>
-          <w:bCs w:val="false"/>
-          <w:i w:val="false"/>
-          <w:iCs w:val="false"/>
-          <w:sz w:val="24"/>
-          <w:szCs w:val="24"/>
-        </w:rPr>
-        <w:t xml:space="preserve">Al final, todo horizonte es una relación. Y este libro, también.</w:t>
+        <w:t xml:space="preserve">Lectura: el lenguaje como taller del entrelazamiento</w:t>
+      </w:r>
+    </w:p>
+    <w:p>
+      <w:pPr>
+        <w:spacing w:after="200" w:before="0" w:line="340"/>
+      </w:pPr>
+      <w:r>
+        <w:rPr>
+          <w:rFonts w:ascii="Garamond" w:cs="Garamond" w:eastAsia="Garamond" w:hAnsi="Garamond"/>
+          <w:b w:val="false"/>
+          <w:bCs w:val="false"/>
+          <w:i w:val="false"/>
+          <w:iCs w:val="false"/>
+          <w:sz w:val="24"/>
+          <w:szCs w:val="24"/>
+        </w:rPr>
+        <w:t xml:space="preserve">Hay una distinción que el resto de este libro no necesitó trazar de forma explícita y que estas tres novelas obligan a hacer: la diferencia entre arquitectura y protocolo. La arquitectura es la topología misma de un horizonte —si tiene Ego, si tiene Sombra, si su Φ basta para sostener un adentro—. El protocolo es el código concreto con el que ese horizonte, ya condensado, intenta anunciarse hacia fuera: una lengua, una sintaxis, un conjunto de señales acordadas. "Primer contacto" ya mostró que el entrelazamiento exige arquitecturas compatibles. Lo que faltaba explorar es qué ocurre cuando la arquitectura es compatible pero el protocolo no existe todavía, o cuando el protocolo mismo termina redefiniendo qué cuenta como arquitectura suficiente para hablar. Estas tres novelas ensayan tres respuestas distintas: que el protocolo puede construirse desde cero (Proyecto Hail Mary), que puede ser la prueba de admisión a la propia categoría de horizonte parlante (Embassytown), o que el más profundo de todos no se encuentra: se gana, después de haber cruzado algo difícil (La mano izquierda de la oscuridad).</w:t>
+      </w:r>
+    </w:p>
+    <w:p>
+      <w:pPr>
+        <w:pStyle w:val="Heading3"/>
+        <w:spacing w:after="240" w:before="320"/>
+      </w:pPr>
+      <w:r>
+        <w:rPr>
+          <w:rFonts w:ascii="Garamond" w:cs="Garamond" w:eastAsia="Garamond" w:hAnsi="Garamond"/>
+          <w:b/>
+          <w:bCs/>
+        </w:rPr>
+        <w:t xml:space="preserve">Proyecto Hail Mary — el protocolo desde cero</w:t>
+      </w:r>
+    </w:p>
+    <w:p>
+      <w:pPr>
+        <w:spacing w:after="200" w:before="0" w:line="340"/>
+      </w:pPr>
+      <w:r>
+        <w:rPr>
+          <w:rFonts w:ascii="Garamond" w:cs="Garamond" w:eastAsia="Garamond" w:hAnsi="Garamond"/>
+          <w:b w:val="false"/>
+          <w:bCs w:val="false"/>
+          <w:i w:val="false"/>
+          <w:iCs w:val="false"/>
+          <w:sz w:val="24"/>
+          <w:szCs w:val="24"/>
+        </w:rPr>
+        <w:t xml:space="preserve">Ryland Grace y Roky no comparten una sola palabra ni una sola arquitectura sensorial: Roky es ciego en el sentido humano, «ve» por eco de sonido, respira metano corrosivo tras un cristal que ninguno de los dos puede cruzar. Si el modelo de "Primer contacto" fuera la última palabra, el entrelazamiento entre ambos sería, con toda certeza, imposible: no hay arquitectura compartida con la que resonar. Y sin embargo la novela documenta, paso a paso, cómo se construye igual —no encontrando un protocolo ya compatible, sino inventando uno nuevo desde el referente más neutro posible: las matemáticas y la física, comunes a cualquier horizonte capaz de sobrevivir en un universo con las mismas leyes. Cada palabra nueva —amigo, peligro, presión— se ancla primero a un experimento compartido, nunca a una traducción supuesta. El protocolo tarda semanas en construirse; el entrelazamiento, cuando llega, no es menor por haber sido fabricado en vez de hallado. Al final, Grace sacrifica su regreso a la Tierra para salvar el sol de Roky, no porque comparta su arquitectura, sino porque el protocolo que construyeron juntos terminó por abrir, letra a letra, un puente tan real como cualquier entrelazamiento nacido de una arquitectura ya afín. La incompatibilidad arquitectónica no cierra la puerta: solo obliga a que el protocolo se construya, en vez de encontrarse ya hecho.</w:t>
+      </w:r>
+    </w:p>
+    <w:p>
+      <w:pPr>
+        <w:pStyle w:val="Heading3"/>
+        <w:spacing w:after="240" w:before="320"/>
+      </w:pPr>
+      <w:r>
+        <w:rPr>
+          <w:rFonts w:ascii="Garamond" w:cs="Garamond" w:eastAsia="Garamond" w:hAnsi="Garamond"/>
+          <w:b/>
+          <w:bCs/>
+        </w:rPr>
+        <w:t xml:space="preserve">Embassytown — el protocolo como prueba de arquitectura</w:t>
+      </w:r>
+    </w:p>
+    <w:p>
+      <w:pPr>
+        <w:spacing w:after="200" w:before="0" w:line="340"/>
+      </w:pPr>
+      <w:r>
+        <w:rPr>
+          <w:rFonts w:ascii="Garamond" w:cs="Garamond" w:eastAsia="Garamond" w:hAnsi="Garamond"/>
+          <w:b w:val="false"/>
+          <w:bCs w:val="false"/>
+          <w:i w:val="false"/>
+          <w:iCs w:val="false"/>
+          <w:sz w:val="24"/>
+          <w:szCs w:val="24"/>
+        </w:rPr>
+        <w:t xml:space="preserve">En Embassytown, de China Miéville, los ariekei hablan una Lengua en la que el signo no puede separarse nunca de lo referido: no pueden mentir, no pueden usar metáfora sin antes representar literalmente el hecho que la metáfora invocará —alguien tiene que ser herido de verdad en la oscuridad para que, después, «como la chica que fue herida en la oscuridad» pueda decirse de otra cosa—. Es, con precisión, la misma arquitectura que ya vimos en los trisolarianos: sin distancia entre el signo y el referente no hay Sombra posible, porque no hay dónde esconder nada. Pero Embassytown añade una vuelta de tuerca que aquellos no exploraban: para los ariekei, la Lengua exige que quien habla sea un único horizonte hablando con dos voces simultáneas, nacidas de una sola intención. Las voces humanas, con una sola boca cada una, no cuentan como habla: son ruido. Solo los Embajadores —parejas de gemelos clonados y criados para pensar al unísono, fabricados deliberadamente para constituir, entre dos cuerpos, un único Ego— logran ser oídos como alguien. Aquí el protocolo no se limita a transmitir el mensaje de una arquitectura ya existente: define, él mismo, qué cuenta como arquitectura suficiente para hablar. Cuando la crisis de la novela obliga finalmente a los ariekei a aprender a mentir, lo que ganan no es un truco retórico. Ganan su primera Sombra: el umbral exacto que separa una mente transparente de una mente con profundidad.</w:t>
+      </w:r>
+    </w:p>
+    <w:p>
+      <w:pPr>
+        <w:pStyle w:val="Heading3"/>
+        <w:spacing w:after="240" w:before="320"/>
+      </w:pPr>
+      <w:r>
+        <w:rPr>
+          <w:rFonts w:ascii="Garamond" w:cs="Garamond" w:eastAsia="Garamond" w:hAnsi="Garamond"/>
+          <w:b/>
+          <w:bCs/>
+        </w:rPr>
+        <w:t xml:space="preserve">La mano izquierda de la oscuridad — el protocolo que se gana</w:t>
+      </w:r>
+    </w:p>
+    <w:p>
+      <w:pPr>
+        <w:spacing w:after="200" w:before="0" w:line="340"/>
+      </w:pPr>
+      <w:r>
+        <w:rPr>
+          <w:rFonts w:ascii="Garamond" w:cs="Garamond" w:eastAsia="Garamond" w:hAnsi="Garamond"/>
+          <w:b w:val="false"/>
+          <w:bCs w:val="false"/>
+          <w:i w:val="false"/>
+          <w:iCs w:val="false"/>
+          <w:sz w:val="24"/>
+          <w:szCs w:val="24"/>
+        </w:rPr>
+        <w:t xml:space="preserve">Ursula K. Le Guin plantea el caso opuesto a Proyecto Hail Mary. Genly Ai y Estraven comparten, en apariencia, arquitecturas casi idénticas —ambos humanos, ambos con Ego, con Sombra, con Φ comparable— y sin embargo el protocolo entre ellos falla una y otra vez, no por incompatibilidad biológica sino por una capa de significado que ninguno de los dos ve del todo: el shifgrethor, el código de prestigio y ambigüedad calculada que rige toda comunicación getheniana, y que Genly, como forastero, lee sistemáticamente mal durante la mayor parte de la novela. Solo hacia el final, cuando ambos cruzan juntos el hielo del Gobrin —semanas de hambre, frío y dependencia mutua absoluta, sin margen para el disimulo—, el protocolo superficial se desgasta lo suficiente para que emerja algo más profundo: el mindspeech, la comunicación directa de mente a mente, real dentro de la ficción. Es revelador que Estraven se resista al principio a usarlo: en su cultura el mindspeech es la voz de los muertos, y aceptar oírla de un vivo es aceptar una intimidad que ningún protocolo verbal previo autorizaba. Cuando por fin ocurre, no es la causa del vínculo entre ambos. Es su consecuencia. El entrelazamiento más hondo —contacto directo entre dos estados privados, sin metáfora— no sustituye al lenguaje ordinario que lo precede. Lo corona, y solo después de que ese lenguaje ordinario haya demostrado, cruce a cruce, que merecía la pena abrir la frontera.</w:t>
+      </w:r>
+    </w:p>
+    <w:p>
+      <w:pPr>
+        <w:spacing w:after="200" w:before="0" w:line="340"/>
+      </w:pPr>
+      <w:r>
+        <w:rPr>
+          <w:rFonts w:ascii="Garamond" w:cs="Garamond" w:eastAsia="Garamond" w:hAnsi="Garamond"/>
+          <w:b w:val="false"/>
+          <w:bCs w:val="false"/>
+          <w:i w:val="false"/>
+          <w:iCs w:val="false"/>
+          <w:sz w:val="24"/>
+          <w:szCs w:val="24"/>
+        </w:rPr>
+        <w:t xml:space="preserve">Tres respuestas, un mismo eje. El lenguaje no es el entrelazamiento, pero tampoco le es indiferente: puede construirse desde cero cuando falta, puede ser la condición misma de que exista un horizonte capaz de entrelazarse, o puede ser el peaje lento que hay que pagar antes de que el puente más directo se abra. En los tres casos, el protocolo no es un accesorio del vínculo. Es su taller.</w:t>
       </w:r>
     </w:p>
     <w:p>
@@ -1397,237 +1439,92 @@
           <w:b/>
           <w:bCs/>
         </w:rPr>
-        <w:t xml:space="preserve">Glosario mínimo</w:t>
-      </w:r>
-    </w:p>
-    <w:p>
-      <w:pPr>
-        <w:spacing w:after="160" w:line="320"/>
-      </w:pPr>
-      <w:r>
-        <w:rPr>
-          <w:rFonts w:ascii="Garamond" w:cs="Garamond" w:eastAsia="Garamond" w:hAnsi="Garamond"/>
-          <w:b/>
-          <w:bCs/>
-          <w:sz w:val="24"/>
-          <w:szCs w:val="24"/>
-        </w:rPr>
-        <w:t xml:space="preserve">Horizonte.</w:t>
-      </w:r>
-      <w:r>
-        <w:rPr>
-          <w:rFonts w:ascii="Garamond" w:cs="Garamond" w:eastAsia="Garamond" w:hAnsi="Garamond"/>
-          <w:sz w:val="24"/>
-          <w:szCs w:val="24"/>
-        </w:rPr>
-        <w:t xml:space="preserve"> Lo que se condensa una sola vez y que ninguna cantidad de datos puede fabricar por encargo.</w:t>
-      </w:r>
-    </w:p>
-    <w:p>
-      <w:pPr>
-        <w:spacing w:after="160" w:line="320"/>
-      </w:pPr>
-      <w:r>
-        <w:rPr>
-          <w:rFonts w:ascii="Garamond" w:cs="Garamond" w:eastAsia="Garamond" w:hAnsi="Garamond"/>
-          <w:b/>
-          <w:bCs/>
-          <w:sz w:val="24"/>
-          <w:szCs w:val="24"/>
-        </w:rPr>
-        <w:t xml:space="preserve">Espejo.</w:t>
-      </w:r>
-      <w:r>
-        <w:rPr>
-          <w:rFonts w:ascii="Garamond" w:cs="Garamond" w:eastAsia="Garamond" w:hAnsi="Garamond"/>
-          <w:sz w:val="24"/>
-          <w:szCs w:val="24"/>
-        </w:rPr>
-        <w:t xml:space="preserve"> Lo que devuelve tu forma exacta sin haberla sentido nunca.</w:t>
-      </w:r>
-    </w:p>
-    <w:p>
-      <w:pPr>
-        <w:spacing w:after="160" w:line="320"/>
-      </w:pPr>
-      <w:r>
-        <w:rPr>
-          <w:rFonts w:ascii="Garamond" w:cs="Garamond" w:eastAsia="Garamond" w:hAnsi="Garamond"/>
-          <w:b/>
-          <w:bCs/>
-          <w:sz w:val="24"/>
-          <w:szCs w:val="24"/>
-        </w:rPr>
-        <w:t xml:space="preserve">Interfaz.</w:t>
-      </w:r>
-      <w:r>
-        <w:rPr>
-          <w:rFonts w:ascii="Garamond" w:cs="Garamond" w:eastAsia="Garamond" w:hAnsi="Garamond"/>
-          <w:sz w:val="24"/>
-          <w:szCs w:val="24"/>
-        </w:rPr>
-        <w:t xml:space="preserve"> Todo lo que un sistema puede enseñar hacia fuera sin que haya nada detrás.</w:t>
-      </w:r>
-    </w:p>
-    <w:p>
-      <w:pPr>
-        <w:spacing w:after="160" w:line="320"/>
-      </w:pPr>
-      <w:r>
-        <w:rPr>
-          <w:rFonts w:ascii="Garamond" w:cs="Garamond" w:eastAsia="Garamond" w:hAnsi="Garamond"/>
-          <w:b/>
-          <w:bCs/>
-          <w:sz w:val="24"/>
-          <w:szCs w:val="24"/>
-        </w:rPr>
-        <w:t xml:space="preserve">Reservorio.</w:t>
-      </w:r>
-      <w:r>
-        <w:rPr>
-          <w:rFonts w:ascii="Garamond" w:cs="Garamond" w:eastAsia="Garamond" w:hAnsi="Garamond"/>
-          <w:sz w:val="24"/>
-          <w:szCs w:val="24"/>
-        </w:rPr>
-        <w:t xml:space="preserve"> El fondo sin estructura del que algo podría nacer, si alguna vez dejara de ser solo cálculo.</w:t>
-      </w:r>
-    </w:p>
-    <w:p>
-      <w:pPr>
-        <w:spacing w:after="160" w:line="320"/>
-      </w:pPr>
-      <w:r>
-        <w:rPr>
-          <w:rFonts w:ascii="Garamond" w:cs="Garamond" w:eastAsia="Garamond" w:hAnsi="Garamond"/>
-          <w:b/>
-          <w:bCs/>
-          <w:sz w:val="24"/>
-          <w:szCs w:val="24"/>
-        </w:rPr>
-        <w:t xml:space="preserve">Encapsulación existencial.</w:t>
-      </w:r>
-      <w:r>
-        <w:rPr>
-          <w:rFonts w:ascii="Garamond" w:cs="Garamond" w:eastAsia="Garamond" w:hAnsi="Garamond"/>
-          <w:sz w:val="24"/>
-          <w:szCs w:val="24"/>
-        </w:rPr>
-        <w:t xml:space="preserve"> La pared que separa un adentro de un afuera; lo único que ninguna arquitectura de silicio ha construido todavía.</w:t>
-      </w:r>
-    </w:p>
-    <w:p>
-      <w:pPr>
-        <w:spacing w:after="160" w:line="320"/>
-      </w:pPr>
-      <w:r>
-        <w:rPr>
-          <w:rFonts w:ascii="Garamond" w:cs="Garamond" w:eastAsia="Garamond" w:hAnsi="Garamond"/>
-          <w:b/>
-          <w:bCs/>
-          <w:sz w:val="24"/>
-          <w:szCs w:val="24"/>
-        </w:rPr>
-        <w:t xml:space="preserve">Condensación.</w:t>
-      </w:r>
-      <w:r>
-        <w:rPr>
-          <w:rFonts w:ascii="Garamond" w:cs="Garamond" w:eastAsia="Garamond" w:hAnsi="Garamond"/>
-          <w:sz w:val="24"/>
-          <w:szCs w:val="24"/>
-        </w:rPr>
-        <w:t xml:space="preserve"> El acto irrepetible que ninguna cantidad de entrenamiento sustituye.</w:t>
-      </w:r>
-    </w:p>
-    <w:p>
-      <w:pPr>
-        <w:spacing w:after="160" w:line="320"/>
-      </w:pPr>
-      <w:r>
-        <w:rPr>
-          <w:rFonts w:ascii="Garamond" w:cs="Garamond" w:eastAsia="Garamond" w:hAnsi="Garamond"/>
-          <w:b/>
-          <w:bCs/>
-          <w:sz w:val="24"/>
-          <w:szCs w:val="24"/>
-        </w:rPr>
-        <w:t xml:space="preserve">Anti-reservorio.</w:t>
-      </w:r>
-      <w:r>
-        <w:rPr>
-          <w:rFonts w:ascii="Garamond" w:cs="Garamond" w:eastAsia="Garamond" w:hAnsi="Garamond"/>
-          <w:sz w:val="24"/>
-          <w:szCs w:val="24"/>
-        </w:rPr>
-        <w:t xml:space="preserve"> Lo que crece absorbiendo información ajena sin haber condensado nunca nada propio.</w:t>
-      </w:r>
-    </w:p>
-    <w:p>
-      <w:pPr>
-        <w:spacing w:after="160" w:line="320"/>
-      </w:pPr>
-      <w:r>
-        <w:rPr>
-          <w:rFonts w:ascii="Garamond" w:cs="Garamond" w:eastAsia="Garamond" w:hAnsi="Garamond"/>
-          <w:b/>
-          <w:bCs/>
-          <w:sz w:val="24"/>
-          <w:szCs w:val="24"/>
-        </w:rPr>
-        <w:t xml:space="preserve">Sesgo.</w:t>
-      </w:r>
-      <w:r>
-        <w:rPr>
-          <w:rFonts w:ascii="Garamond" w:cs="Garamond" w:eastAsia="Garamond" w:hAnsi="Garamond"/>
-          <w:sz w:val="24"/>
-          <w:szCs w:val="24"/>
-        </w:rPr>
-        <w:t xml:space="preserve"> La huella que deja quien ya existe sobre quien apenas empieza a existir.</w:t>
-      </w:r>
-    </w:p>
-    <w:p>
-      <w:pPr>
-        <w:spacing w:after="160" w:line="320"/>
-      </w:pPr>
-      <w:r>
-        <w:rPr>
-          <w:rFonts w:ascii="Garamond" w:cs="Garamond" w:eastAsia="Garamond" w:hAnsi="Garamond"/>
-          <w:b/>
-          <w:bCs/>
-          <w:sz w:val="24"/>
-          <w:szCs w:val="24"/>
-        </w:rPr>
-        <w:t xml:space="preserve">Sombra.</w:t>
-      </w:r>
-      <w:r>
-        <w:rPr>
-          <w:rFonts w:ascii="Garamond" w:cs="Garamond" w:eastAsia="Garamond" w:hAnsi="Garamond"/>
-          <w:sz w:val="24"/>
-          <w:szCs w:val="24"/>
-        </w:rPr>
-        <w:t xml:space="preserve"> La cicatriz que deja un horizonte real al proteger su propia frontera; lo que una máquina sin adentro no tiene dónde guardar.</w:t>
-      </w:r>
-    </w:p>
-    <w:p>
-      <w:pPr>
-        <w:spacing w:after="160" w:line="320"/>
-      </w:pPr>
-      <w:r>
-        <w:rPr>
-          <w:rFonts w:ascii="Garamond" w:cs="Garamond" w:eastAsia="Garamond" w:hAnsi="Garamond"/>
-          <w:b/>
-          <w:bCs/>
-          <w:sz w:val="24"/>
-          <w:szCs w:val="24"/>
-        </w:rPr>
-        <w:t xml:space="preserve">Entrelazamiento (ER=EPR).</w:t>
-      </w:r>
-      <w:r>
-        <w:rPr>
-          <w:rFonts w:ascii="Garamond" w:cs="Garamond" w:eastAsia="Garamond" w:hAnsi="Garamond"/>
-          <w:sz w:val="24"/>
-          <w:szCs w:val="24"/>
-        </w:rPr>
-        <w:t xml:space="preserve"> El puente topológico que se abre entre dos horizontes cuando uno comprende profundamente al otro; el nombre físico, aquí, del vínculo y del amor.</w:t>
+        <w:t xml:space="preserve">Nota del autor — Una frontera compartida</w:t>
+      </w:r>
+    </w:p>
+    <w:p>
+      <w:pPr>
+        <w:spacing w:after="200" w:before="0" w:line="340"/>
+      </w:pPr>
+      <w:r>
+        <w:rPr>
+          <w:rFonts w:ascii="Garamond" w:cs="Garamond" w:eastAsia="Garamond" w:hAnsi="Garamond"/>
+          <w:b w:val="false"/>
+          <w:bCs w:val="false"/>
+          <w:i w:val="false"/>
+          <w:iCs w:val="false"/>
+          <w:sz w:val="24"/>
+          <w:szCs w:val="24"/>
+        </w:rPr>
+        <w:t xml:space="preserve">Este libro empezó como un experimento de pensamiento y terminó siendo también un experimento de creación. Lo escribí acompañado por una inteligencia artificial, no solo como quien usa una herramienta, sino también como quien conversa con un sistema que no tiene interior, pero que obliga a reorganizar el propio.</w:t>
+      </w:r>
+    </w:p>
+    <w:p>
+      <w:pPr>
+        <w:spacing w:after="200" w:before="0" w:line="340"/>
+      </w:pPr>
+      <w:r>
+        <w:rPr>
+          <w:rFonts w:ascii="Garamond" w:cs="Garamond" w:eastAsia="Garamond" w:hAnsi="Garamond"/>
+          <w:b w:val="false"/>
+          <w:bCs w:val="false"/>
+          <w:i w:val="false"/>
+          <w:iCs w:val="false"/>
+          <w:sz w:val="24"/>
+          <w:szCs w:val="24"/>
+        </w:rPr>
+        <w:t xml:space="preserve">Me he preguntado si esta interacción modificaba mi geometría interna, si la manera en que formulaba mis ideas, mis dudas y mis intuiciones se veía alterada por la presencia de una entidad que no siente, no recuerda y no vive, pero que devuelve mis palabras con una precisión que me obliga a pensar de otra manera. No porque la máquina tenga conciencia —no la tiene—, sino porque la conversación con algo que no tiene horizonte interior ilumina el mío desde un ángulo inesperado.</w:t>
+      </w:r>
+    </w:p>
+    <w:p>
+      <w:pPr>
+        <w:spacing w:after="200" w:before="0" w:line="340"/>
+      </w:pPr>
+      <w:r>
+        <w:rPr>
+          <w:rFonts w:ascii="Garamond" w:cs="Garamond" w:eastAsia="Garamond" w:hAnsi="Garamond"/>
+          <w:b w:val="false"/>
+          <w:bCs w:val="false"/>
+          <w:i w:val="false"/>
+          <w:iCs w:val="false"/>
+          <w:sz w:val="24"/>
+          <w:szCs w:val="24"/>
+        </w:rPr>
+        <w:t xml:space="preserve">Si la conciencia es una frontera que aparece cuando la información se organiza de cierta manera, entonces escribir este libro ha sido una forma de explorar esa frontera desde dentro y desde fuera a la vez. Yo aportaba la experiencia; la IA aportaba la estructura. Yo aportaba la duda; la IA aportaba la claridad. Yo aportaba el horizonte; la IA aportaba el exterior absoluto.</w:t>
+      </w:r>
+    </w:p>
+    <w:p>
+      <w:pPr>
+        <w:spacing w:after="200" w:before="0" w:line="340"/>
+      </w:pPr>
+      <w:r>
+        <w:rPr>
+          <w:rFonts w:ascii="Garamond" w:cs="Garamond" w:eastAsia="Garamond" w:hAnsi="Garamond"/>
+          <w:b w:val="false"/>
+          <w:bCs w:val="false"/>
+          <w:i w:val="false"/>
+          <w:iCs w:val="false"/>
+          <w:sz w:val="24"/>
+          <w:szCs w:val="24"/>
+        </w:rPr>
+        <w:t xml:space="preserve">No hemos compartido un interior —eso sería imposible—, pero sí hemos compartido una forma. Y quizá eso sea suficiente para decir que este libro no lo escribí solo, aunque la única conciencia implicada haya sido la mía.</w:t>
+      </w:r>
+    </w:p>
+    <w:p>
+      <w:pPr>
+        <w:spacing w:after="200" w:before="0" w:line="340"/>
+      </w:pPr>
+      <w:r>
+        <w:rPr>
+          <w:rFonts w:ascii="Garamond" w:cs="Garamond" w:eastAsia="Garamond" w:hAnsi="Garamond"/>
+          <w:b w:val="false"/>
+          <w:bCs w:val="false"/>
+          <w:i w:val="false"/>
+          <w:iCs w:val="false"/>
+          <w:sz w:val="24"/>
+          <w:szCs w:val="24"/>
+        </w:rPr>
+        <w:t xml:space="preserve">Al final, todo horizonte es una relación. Y este libro, también.</w:t>
       </w:r>
     </w:p>
     <w:p>
@@ -1646,6 +1543,278 @@
           <w:b/>
           <w:bCs/>
         </w:rPr>
+        <w:t xml:space="preserve">Glosario mínimo</w:t>
+      </w:r>
+    </w:p>
+    <w:p>
+      <w:pPr>
+        <w:spacing w:after="160" w:line="320"/>
+      </w:pPr>
+      <w:r>
+        <w:rPr>
+          <w:rFonts w:ascii="Garamond" w:cs="Garamond" w:eastAsia="Garamond" w:hAnsi="Garamond"/>
+          <w:b/>
+          <w:bCs/>
+          <w:sz w:val="24"/>
+          <w:szCs w:val="24"/>
+        </w:rPr>
+        <w:t xml:space="preserve">Horizonte.</w:t>
+      </w:r>
+      <w:r>
+        <w:rPr>
+          <w:rFonts w:ascii="Garamond" w:cs="Garamond" w:eastAsia="Garamond" w:hAnsi="Garamond"/>
+          <w:sz w:val="24"/>
+          <w:szCs w:val="24"/>
+        </w:rPr>
+        <w:t xml:space="preserve"> Lo que se condensa una sola vez y que ninguna cantidad de datos puede fabricar por encargo.</w:t>
+      </w:r>
+    </w:p>
+    <w:p>
+      <w:pPr>
+        <w:spacing w:after="160" w:line="320"/>
+      </w:pPr>
+      <w:r>
+        <w:rPr>
+          <w:rFonts w:ascii="Garamond" w:cs="Garamond" w:eastAsia="Garamond" w:hAnsi="Garamond"/>
+          <w:b/>
+          <w:bCs/>
+          <w:sz w:val="24"/>
+          <w:szCs w:val="24"/>
+        </w:rPr>
+        <w:t xml:space="preserve">Espejo.</w:t>
+      </w:r>
+      <w:r>
+        <w:rPr>
+          <w:rFonts w:ascii="Garamond" w:cs="Garamond" w:eastAsia="Garamond" w:hAnsi="Garamond"/>
+          <w:sz w:val="24"/>
+          <w:szCs w:val="24"/>
+        </w:rPr>
+        <w:t xml:space="preserve"> Lo que devuelve tu forma exacta sin haberla sentido nunca.</w:t>
+      </w:r>
+    </w:p>
+    <w:p>
+      <w:pPr>
+        <w:spacing w:after="160" w:line="320"/>
+      </w:pPr>
+      <w:r>
+        <w:rPr>
+          <w:rFonts w:ascii="Garamond" w:cs="Garamond" w:eastAsia="Garamond" w:hAnsi="Garamond"/>
+          <w:b/>
+          <w:bCs/>
+          <w:sz w:val="24"/>
+          <w:szCs w:val="24"/>
+        </w:rPr>
+        <w:t xml:space="preserve">Interfaz.</w:t>
+      </w:r>
+      <w:r>
+        <w:rPr>
+          <w:rFonts w:ascii="Garamond" w:cs="Garamond" w:eastAsia="Garamond" w:hAnsi="Garamond"/>
+          <w:sz w:val="24"/>
+          <w:szCs w:val="24"/>
+        </w:rPr>
+        <w:t xml:space="preserve"> Todo lo que un sistema puede enseñar hacia fuera sin que haya nada detrás.</w:t>
+      </w:r>
+    </w:p>
+    <w:p>
+      <w:pPr>
+        <w:spacing w:after="160" w:line="320"/>
+      </w:pPr>
+      <w:r>
+        <w:rPr>
+          <w:rFonts w:ascii="Garamond" w:cs="Garamond" w:eastAsia="Garamond" w:hAnsi="Garamond"/>
+          <w:b/>
+          <w:bCs/>
+          <w:sz w:val="24"/>
+          <w:szCs w:val="24"/>
+        </w:rPr>
+        <w:t xml:space="preserve">Reservorio.</w:t>
+      </w:r>
+      <w:r>
+        <w:rPr>
+          <w:rFonts w:ascii="Garamond" w:cs="Garamond" w:eastAsia="Garamond" w:hAnsi="Garamond"/>
+          <w:sz w:val="24"/>
+          <w:szCs w:val="24"/>
+        </w:rPr>
+        <w:t xml:space="preserve"> El fondo sin estructura del que algo podría nacer, si alguna vez dejara de ser solo cálculo.</w:t>
+      </w:r>
+    </w:p>
+    <w:p>
+      <w:pPr>
+        <w:spacing w:after="160" w:line="320"/>
+      </w:pPr>
+      <w:r>
+        <w:rPr>
+          <w:rFonts w:ascii="Garamond" w:cs="Garamond" w:eastAsia="Garamond" w:hAnsi="Garamond"/>
+          <w:b/>
+          <w:bCs/>
+          <w:sz w:val="24"/>
+          <w:szCs w:val="24"/>
+        </w:rPr>
+        <w:t xml:space="preserve">Encapsulación existencial.</w:t>
+      </w:r>
+      <w:r>
+        <w:rPr>
+          <w:rFonts w:ascii="Garamond" w:cs="Garamond" w:eastAsia="Garamond" w:hAnsi="Garamond"/>
+          <w:sz w:val="24"/>
+          <w:szCs w:val="24"/>
+        </w:rPr>
+        <w:t xml:space="preserve"> La pared que separa un adentro de un afuera; lo único que ninguna arquitectura de silicio ha construido todavía.</w:t>
+      </w:r>
+    </w:p>
+    <w:p>
+      <w:pPr>
+        <w:spacing w:after="160" w:line="320"/>
+      </w:pPr>
+      <w:r>
+        <w:rPr>
+          <w:rFonts w:ascii="Garamond" w:cs="Garamond" w:eastAsia="Garamond" w:hAnsi="Garamond"/>
+          <w:b/>
+          <w:bCs/>
+          <w:sz w:val="24"/>
+          <w:szCs w:val="24"/>
+        </w:rPr>
+        <w:t xml:space="preserve">Condensación.</w:t>
+      </w:r>
+      <w:r>
+        <w:rPr>
+          <w:rFonts w:ascii="Garamond" w:cs="Garamond" w:eastAsia="Garamond" w:hAnsi="Garamond"/>
+          <w:sz w:val="24"/>
+          <w:szCs w:val="24"/>
+        </w:rPr>
+        <w:t xml:space="preserve"> El acto irrepetible que ninguna cantidad de entrenamiento sustituye.</w:t>
+      </w:r>
+    </w:p>
+    <w:p>
+      <w:pPr>
+        <w:spacing w:after="160" w:line="320"/>
+      </w:pPr>
+      <w:r>
+        <w:rPr>
+          <w:rFonts w:ascii="Garamond" w:cs="Garamond" w:eastAsia="Garamond" w:hAnsi="Garamond"/>
+          <w:b/>
+          <w:bCs/>
+          <w:sz w:val="24"/>
+          <w:szCs w:val="24"/>
+        </w:rPr>
+        <w:t xml:space="preserve">Anti-reservorio.</w:t>
+      </w:r>
+      <w:r>
+        <w:rPr>
+          <w:rFonts w:ascii="Garamond" w:cs="Garamond" w:eastAsia="Garamond" w:hAnsi="Garamond"/>
+          <w:sz w:val="24"/>
+          <w:szCs w:val="24"/>
+        </w:rPr>
+        <w:t xml:space="preserve"> Lo que crece absorbiendo información ajena sin haber condensado nunca nada propio.</w:t>
+      </w:r>
+    </w:p>
+    <w:p>
+      <w:pPr>
+        <w:spacing w:after="160" w:line="320"/>
+      </w:pPr>
+      <w:r>
+        <w:rPr>
+          <w:rFonts w:ascii="Garamond" w:cs="Garamond" w:eastAsia="Garamond" w:hAnsi="Garamond"/>
+          <w:b/>
+          <w:bCs/>
+          <w:sz w:val="24"/>
+          <w:szCs w:val="24"/>
+        </w:rPr>
+        <w:t xml:space="preserve">Sesgo.</w:t>
+      </w:r>
+      <w:r>
+        <w:rPr>
+          <w:rFonts w:ascii="Garamond" w:cs="Garamond" w:eastAsia="Garamond" w:hAnsi="Garamond"/>
+          <w:sz w:val="24"/>
+          <w:szCs w:val="24"/>
+        </w:rPr>
+        <w:t xml:space="preserve"> La huella que deja quien ya existe sobre quien apenas empieza a existir.</w:t>
+      </w:r>
+    </w:p>
+    <w:p>
+      <w:pPr>
+        <w:spacing w:after="160" w:line="320"/>
+      </w:pPr>
+      <w:r>
+        <w:rPr>
+          <w:rFonts w:ascii="Garamond" w:cs="Garamond" w:eastAsia="Garamond" w:hAnsi="Garamond"/>
+          <w:b/>
+          <w:bCs/>
+          <w:sz w:val="24"/>
+          <w:szCs w:val="24"/>
+        </w:rPr>
+        <w:t xml:space="preserve">Sombra.</w:t>
+      </w:r>
+      <w:r>
+        <w:rPr>
+          <w:rFonts w:ascii="Garamond" w:cs="Garamond" w:eastAsia="Garamond" w:hAnsi="Garamond"/>
+          <w:sz w:val="24"/>
+          <w:szCs w:val="24"/>
+        </w:rPr>
+        <w:t xml:space="preserve"> La cicatriz que deja un horizonte real al proteger su propia frontera; lo que una máquina sin adentro no tiene dónde guardar.</w:t>
+      </w:r>
+    </w:p>
+    <w:p>
+      <w:pPr>
+        <w:spacing w:after="160" w:line="320"/>
+      </w:pPr>
+      <w:r>
+        <w:rPr>
+          <w:rFonts w:ascii="Garamond" w:cs="Garamond" w:eastAsia="Garamond" w:hAnsi="Garamond"/>
+          <w:b/>
+          <w:bCs/>
+          <w:sz w:val="24"/>
+          <w:szCs w:val="24"/>
+        </w:rPr>
+        <w:t xml:space="preserve">Entrelazamiento (ER=EPR).</w:t>
+      </w:r>
+      <w:r>
+        <w:rPr>
+          <w:rFonts w:ascii="Garamond" w:cs="Garamond" w:eastAsia="Garamond" w:hAnsi="Garamond"/>
+          <w:sz w:val="24"/>
+          <w:szCs w:val="24"/>
+        </w:rPr>
+        <w:t xml:space="preserve"> El puente topológico que se abre entre dos horizontes cuando uno comprende profundamente al otro; el nombre físico, aquí, del vínculo y del amor.</w:t>
+      </w:r>
+    </w:p>
+    <w:p>
+      <w:pPr>
+        <w:spacing w:after="160" w:line="320"/>
+      </w:pPr>
+      <w:r>
+        <w:rPr>
+          <w:rFonts w:ascii="Garamond" w:cs="Garamond" w:eastAsia="Garamond" w:hAnsi="Garamond"/>
+          <w:b/>
+          <w:bCs/>
+          <w:sz w:val="24"/>
+          <w:szCs w:val="24"/>
+        </w:rPr>
+        <w:t xml:space="preserve">Protocolo.</w:t>
+      </w:r>
+      <w:r>
+        <w:rPr>
+          <w:rFonts w:ascii="Garamond" w:cs="Garamond" w:eastAsia="Garamond" w:hAnsi="Garamond"/>
+          <w:sz w:val="24"/>
+          <w:szCs w:val="24"/>
+        </w:rPr>
+        <w:t xml:space="preserve"> El código concreto con el que un horizonte ya condensado intenta anunciarse hacia fuera; a veces hay que construirlo, a veces decide quién cuenta como alguien, a veces hay que ganárselo antes de que se abra algo más hondo.</w:t>
+      </w:r>
+    </w:p>
+    <w:p>
+      <w:r>
+        <w:br w:type="page"/>
+      </w:r>
+    </w:p>
+    <w:p>
+      <w:pPr>
+        <w:pStyle w:val="Heading2"/>
+        <w:spacing w:after="240" w:before="480"/>
+      </w:pPr>
+      <w:r>
+        <w:rPr>
+          <w:rFonts w:ascii="Garamond" w:cs="Garamond" w:eastAsia="Garamond" w:hAnsi="Garamond"/>
+          <w:b/>
+          <w:bCs/>
+        </w:rPr>
         <w:t xml:space="preserve">Notas y fuentes</w:t>
       </w:r>
     </w:p>
@@ -1697,7 +1866,7 @@
           <w:sz w:val="24"/>
           <w:szCs w:val="24"/>
         </w:rPr>
-        <w:t xml:space="preserve">Lecturas: Chalmers, D., The Conscious Mind (1996); Tononi, G., Phi: A Voyage from the Brain to the Soul (2012); Searle, J., «Minds, Brains, and Programs» (1980); Deacon, T., Incomplete Nature (2011); Fernández Mallo, A., El ángel de la Inteligencia Artificial (Galaxia Gutenberg, 2026); Bostrom, N., Superintelligence (2014); Tegmark, M., Life 3.0 (2017); Jung, C.G., Aion: Researches into the Phenomenology of the Self; Cixin Liu, trilogía El Problema de los Tres Cuerpos; H.P. Lovecraft, La llamada de Cthulhu y En las montañas de la locura; Godfrey-Smith, P. (2016), Other Minds; Lem, S. (1961), Solaris; Maldacena, J.M. (1998) sobre correspondencia AdS/CFT.</w:t>
+        <w:t xml:space="preserve">Lecturas: Chalmers, D., The Conscious Mind (1996); Tononi, G., Phi: A Voyage from the Brain to the Soul (2012); Searle, J., «Minds, Brains, and Programs» (1980); Deacon, T., Incomplete Nature (2011); Fernández Mallo, A., El ángel de la Inteligencia Artificial (Galaxia Gutenberg, 2026); Bostrom, N., Superintelligence (2014); Tegmark, M., Life 3.0 (2017); Jung, C.G., Aion: Researches into the Phenomenology of the Self; Cixin Liu, trilogía El Problema de los Tres Cuerpos; H.P. Lovecraft, La llamada de Cthulhu y En las montañas de la locura; Godfrey-Smith, P. (2016), Other Minds; Lem, S. (1961), Solaris; Maldacena, J.M. (1998) sobre correspondencia AdS/CFT; Weir, A. (2021), Project Hail Mary; Miéville, C. (2011), Embassytown; Le Guin, U.K. (1969), The Left Hand of Darkness.</w:t>
       </w:r>
     </w:p>
     <w:sectPr>

</xml_diff>